<commit_message>
auto(daily): dev loop report 2026-06-02
</commit_message>
<xml_diff>
--- a/reports/hypothesis/2026-06-02.docx
+++ b/reports/hypothesis/2026-06-02.docx
@@ -15,7 +15,7 @@
         <w:rPr>
           <w:i/>
         </w:rPr>
-        <w:t>생성일: 2026-06-02 09:15 KST  |  표본: 측정소당 최소 2196건 / 총 11155건</w:t>
+        <w:t>생성일: 2026-06-02 13:59 KST  |  표본: 측정소당 최소 2201건 / 총 11180건</w:t>
       </w:r>
     </w:p>
     <w:p>
@@ -143,7 +143,7 @@
           </w:tcPr>
           <w:p>
             <w:r>
-              <w:t>38.231</w:t>
+              <w:t>38.268</w:t>
             </w:r>
           </w:p>
         </w:tc>
@@ -153,7 +153,7 @@
           </w:tcPr>
           <w:p>
             <w:r>
-              <w:t>34.117</w:t>
+              <w:t>34.128</w:t>
             </w:r>
           </w:p>
         </w:tc>
@@ -163,7 +163,7 @@
           </w:tcPr>
           <w:p>
             <w:r>
-              <w:t>+4.113</w:t>
+              <w:t>+4.139</w:t>
             </w:r>
           </w:p>
         </w:tc>
@@ -215,7 +215,7 @@
           </w:tcPr>
           <w:p>
             <w:r>
-              <w:t>21.270</w:t>
+              <w:t>21.288</w:t>
             </w:r>
           </w:p>
         </w:tc>
@@ -225,7 +225,7 @@
           </w:tcPr>
           <w:p>
             <w:r>
-              <w:t>17.765</w:t>
+              <w:t>17.773</w:t>
             </w:r>
           </w:p>
         </w:tc>
@@ -235,7 +235,7 @@
           </w:tcPr>
           <w:p>
             <w:r>
-              <w:t>+3.505</w:t>
+              <w:t>+3.516</w:t>
             </w:r>
           </w:p>
         </w:tc>
@@ -660,7 +660,7 @@
           </w:tcPr>
           <w:p>
             <w:r>
-              <w:t>37.49</w:t>
+              <w:t>38.04</w:t>
             </w:r>
           </w:p>
         </w:tc>
@@ -722,7 +722,7 @@
           </w:tcPr>
           <w:p>
             <w:r>
-              <w:t>76.43</w:t>
+              <w:t>77.01</w:t>
             </w:r>
           </w:p>
         </w:tc>
@@ -784,7 +784,7 @@
           </w:tcPr>
           <w:p>
             <w:r>
-              <w:t>16.45</w:t>
+              <w:t>16.46</w:t>
             </w:r>
           </w:p>
         </w:tc>
@@ -846,7 +846,7 @@
           </w:tcPr>
           <w:p>
             <w:r>
-              <w:t>142.89</w:t>
+              <w:t>142.84</w:t>
             </w:r>
           </w:p>
         </w:tc>
@@ -908,7 +908,7 @@
           </w:tcPr>
           <w:p>
             <w:r>
-              <w:t>70.95</w:t>
+              <w:t>70.54</w:t>
             </w:r>
           </w:p>
         </w:tc>
@@ -970,7 +970,7 @@
           </w:tcPr>
           <w:p>
             <w:r>
-              <w:t>156.09</w:t>
+              <w:t>156.01</w:t>
             </w:r>
           </w:p>
         </w:tc>
@@ -1029,7 +1029,7 @@
         <w:pStyle w:val="ListBullet"/>
       </w:pPr>
       <w:r>
-        <w:t>'산단 영향군'가 '베이스라인'보다 평균 3.51 높음 (p=0.0000, 효과크기 작음 d=0.26).</w:t>
+        <w:t>'산단 영향군'가 '베이스라인'보다 평균 3.52 높음 (p=0.0000, 효과크기 작음 d=0.26).</w:t>
       </w:r>
     </w:p>
     <w:p>

</xml_diff>